<commit_message>
Make the ePortfolio mobile friendly and add the MongoDB evidence
</commit_message>
<xml_diff>
--- a/assets/downloads/01_Professional_Self_Assessment_Soliev.docx
+++ b/assets/downloads/01_Professional_Self_Assessment_Soliev.docx
@@ -502,7 +502,7 @@
               </w:rPr>
               <w:t xml:space="preserve">Designing for several audiences: owner, accountant and teacher roles, each with access built for its own work, in </w:t>
             </w:r>
-            <w:hyperlink w:history="1" r:id="rIdgaf0rckh7dvokwip_yyt2">
+            <w:hyperlink w:history="1" r:id="rIdwys7wlv93saedxaxtrfpe">
               <w:r>
                 <w:rPr>
                   <w:rStyle w:val="Hyperlink"/>
@@ -521,7 +521,7 @@
               </w:rPr>
               <w:t xml:space="preserve">, and reports organized around each role’s decisions in </w:t>
             </w:r>
-            <w:hyperlink w:history="1" r:id="rIdw10ri0y8dabbuy2ybjffe">
+            <w:hyperlink w:history="1" r:id="rId4dbugcxnuz7r4oiyy2bko">
               <w:r>
                 <w:rPr>
                   <w:rStyle w:val="Hyperlink"/>
@@ -540,7 +540,7 @@
               </w:rPr>
               <w:t xml:space="preserve">. Making work easy for others to review and build on: a </w:t>
             </w:r>
-            <w:hyperlink w:history="1" r:id="rIdpnqpkcqdsapwukf3gzntq">
+            <w:hyperlink w:history="1" r:id="rIdhlsomwjwcp_neyz6qheat">
               <w:r>
                 <w:rPr>
                   <w:rStyle w:val="Hyperlink"/>
@@ -619,7 +619,7 @@
               </w:rPr>
               <w:t xml:space="preserve">Adapting one message to different audiences and forms: the recorded </w:t>
             </w:r>
-            <w:hyperlink w:history="1" r:id="rIds9nwtydaul8if7bfl-p_i">
+            <w:hyperlink w:history="1" r:id="rIddsnzxmui7swkg0iprqace">
               <w:r>
                 <w:rPr>
                   <w:rStyle w:val="Hyperlink"/>
@@ -638,7 +638,7 @@
               </w:rPr>
               <w:t xml:space="preserve"> (oral and visual), the narratives and this self-assessment (written), the diagrams and charts on each enhancement page (visual), a report format for each reader in </w:t>
             </w:r>
-            <w:hyperlink w:history="1" r:id="rIdl49fs1yhkegpmuwe-c7ck">
+            <w:hyperlink w:history="1" r:id="rId4k87la_wrac4re9ebu88s">
               <w:r>
                 <w:rPr>
                   <w:rStyle w:val="Hyperlink"/>
@@ -717,7 +717,7 @@
               </w:rPr>
               <w:t xml:space="preserve">Algorithm analysis and design: replacing an O(n) scan with an O(log n + k) bounded index search, proving that k never exceeds 32, measuring both with a benchmark, and checking them against each other on 5,000 random cases in </w:t>
             </w:r>
-            <w:hyperlink w:history="1" r:id="rIdiz9stlpdl8hrqyq7kbi8-">
+            <w:hyperlink w:history="1" r:id="rIdwogl4cjysjf25tzjdgqes">
               <w:r>
                 <w:rPr>
                   <w:rStyle w:val="Hyperlink"/>
@@ -736,7 +736,7 @@
               </w:rPr>
               <w:t xml:space="preserve">. Weighing index, money and data-model trade-offs in </w:t>
             </w:r>
-            <w:hyperlink w:history="1" r:id="rIdx0kutuibrbvzkf4q3dgfp">
+            <w:hyperlink w:history="1" r:id="rIdc1qbypu4xu7tfmvw1skly">
               <w:r>
                 <w:rPr>
                   <w:rStyle w:val="Hyperlink"/>
@@ -815,7 +815,7 @@
               </w:rPr>
               <w:t xml:space="preserve">Applying established patterns and tools: a generic controller factory and a configuration-driven interface in </w:t>
             </w:r>
-            <w:hyperlink w:history="1" r:id="rIdn_s9a2tcpeoqsqtdefzya">
+            <w:hyperlink w:history="1" r:id="rIdrltncizkn9x9rnq6gblry">
               <w:r>
                 <w:rPr>
                   <w:rStyle w:val="Hyperlink"/>
@@ -834,7 +834,7 @@
               </w:rPr>
               <w:t xml:space="preserve">, compound indexes and a keyed lock in </w:t>
             </w:r>
-            <w:hyperlink w:history="1" r:id="rIdhcfspabnvzx3v_nvrzxpp">
+            <w:hyperlink w:history="1" r:id="rIduccbz75ljcid2qdaem9uc">
               <w:r>
                 <w:rPr>
                   <w:rStyle w:val="Hyperlink"/>
@@ -853,7 +853,7 @@
               </w:rPr>
               <w:t xml:space="preserve">, and MongoDB aggregation pipelines in </w:t>
             </w:r>
-            <w:hyperlink w:history="1" r:id="rIdarigljevhwc4w-aszvfa_">
+            <w:hyperlink w:history="1" r:id="rIdsdv25tsiau5bowq-ddrjx">
               <w:r>
                 <w:rPr>
                   <w:rStyle w:val="Hyperlink"/>
@@ -932,7 +932,7 @@
               </w:rPr>
               <w:t xml:space="preserve">Finding and closing vulnerabilities: role, record and field checks and a stored cross-site scripting fix in </w:t>
             </w:r>
-            <w:hyperlink w:history="1" r:id="rIdez5hwcju8rodygphxosov">
+            <w:hyperlink w:history="1" r:id="rIdggle-tsavysxb9sry7ee6">
               <w:r>
                 <w:rPr>
                   <w:rStyle w:val="Hyperlink"/>
@@ -951,7 +951,7 @@
               </w:rPr>
               <w:t xml:space="preserve">; a booking race closed in </w:t>
             </w:r>
-            <w:hyperlink w:history="1" r:id="rId4gjugif4ckc4-u5alxx-6">
+            <w:hyperlink w:history="1" r:id="rIdeqyckluzugkl9zvzcxjze">
               <w:r>
                 <w:rPr>
                   <w:rStyle w:val="Hyperlink"/>
@@ -970,7 +970,7 @@
               </w:rPr>
               <w:t xml:space="preserve">; defenses against query-operator and spreadsheet-formula injection, support for a least-privilege database account, and a names-only projection for teachers in </w:t>
             </w:r>
-            <w:hyperlink w:history="1" r:id="rIdlxpc2z39s4qchk1t1lupl">
+            <w:hyperlink w:history="1" r:id="rIdbsl_q1nklmqc5pjy4aumm">
               <w:r>
                 <w:rPr>
                   <w:rStyle w:val="Hyperlink"/>
@@ -989,7 +989,7 @@
               </w:rPr>
               <w:t xml:space="preserve">; and two defects found in review and fixed with tests in the </w:t>
             </w:r>
-            <w:hyperlink w:history="1" r:id="rIdrqy6w2owf7rkpsroy4-yb">
+            <w:hyperlink w:history="1" r:id="rIdtljq1wzn0o-wbk5bpnsfd">
               <w:r>
                 <w:rPr>
                   <w:rStyle w:val="Hyperlink"/>

</xml_diff>